<commit_message>
chore: replace em dashes with hyphens across the application
Em dashes read as machine-written copy, so every occurrence of "—" is now
a plain "-". The replacement is literal and covers user-facing strings,
code comments, the schema, the tooling scripts, the e2e specs, the QA plan
sources and the three project docs.

Excluded, deliberately:

- .claude/skills/** — vendored skill definitions, not this application.
- graphify-out/GRAPH_REPORT.md — CI-generated and never hand-edited.
- docs/qa/DrPoojaPhysio-* — generated artefacts, regenerated instead with
  python3 scripts/build-test-plan.py so the PDF, DOCX, HTML and Markdown
  match their sources.

En dashes are untouched (118 remain); only the em dash was in scope.

Verified with npm run test (586 passing), npm run lint and npm run build.

Co-Authored-By: Claude Opus 5 <noreply@anthropic.com>
Claude-Session: https://claude.ai/code/session_018YGJp5nzUv54apmoB6gPm3
</commit_message>
<xml_diff>
--- a/docs/qa/DrPoojaPhysio-QA-Audit-Report.docx
+++ b/docs/qa/DrPoojaPhysio-QA-Audit-Report.docx
@@ -11,7 +11,7 @@
           <w:b/>
           <w:sz w:val="44"/>
         </w:rPr>
-        <w:t>Dr. Pooja's Physio — QA Audit Report</w:t>
+        <w:t>Dr. Pooja's Physio - QA Audit Report</w:t>
       </w:r>
     </w:p>
     <w:p>
@@ -44,7 +44,7 @@
         <w:t xml:space="preserve">Method: </w:t>
       </w:r>
       <w:r>
-        <w:t>Two passes — a live run on 2 Sep, re-verification (static + executed) on 4 Sep</w:t>
+        <w:t>Two passes - a live run on 2 Sep, re-verification (static + executed) on 4 Sep</w:t>
       </w:r>
     </w:p>
     <w:p>
@@ -55,7 +55,7 @@
         <w:t xml:space="preserve">Verdict: </w:t>
       </w:r>
       <w:r>
-        <w:t>Pass after remediation — 13 findings across both passes, all fixed</w:t>
+        <w:t>Pass after remediation - 13 findings across both passes, all fixed</w:t>
       </w:r>
     </w:p>
     <w:p>
@@ -66,7 +66,7 @@
         <w:t xml:space="preserve">Read first: </w:t>
       </w:r>
       <w:r>
-        <w:t>Section 1 — Scope, and what this report is not</w:t>
+        <w:t>Section 1 - Scope, and what this report is not</w:t>
       </w:r>
     </w:p>
     <w:p>
@@ -79,7 +79,7 @@
         <w:pStyle w:val="Heading1"/>
       </w:pPr>
       <w:r>
-        <w:t>QA Audit Report — Dr. Pooja's Physio</w:t>
+        <w:t>QA Audit Report - Dr. Pooja's Physio</w:t>
       </w:r>
     </w:p>
     <w:tbl>
@@ -140,7 +140,7 @@
           <w:p>
             <w:r/>
             <w:r>
-              <w:t xml:space="preserve">Senior QA audit against the manual E2E test plan — </w:t>
+              <w:t xml:space="preserve">Senior QA audit against the manual E2E test plan - </w:t>
             </w:r>
             <w:r>
               <w:rPr>
@@ -173,7 +173,7 @@
           <w:p>
             <w:r/>
             <w:r>
-              <w:t xml:space="preserve">Dr. Pooja's Physio — branch </w:t>
+              <w:t xml:space="preserve">Dr. Pooja's Physio - branch </w:t>
             </w:r>
             <w:r>
               <w:rPr>
@@ -213,7 +213,7 @@
               <w:rPr>
                 <w:b/>
               </w:rPr>
-              <w:t>static and executed only — no live environment was available</w:t>
+              <w:t>static and executed only - no live environment was available</w:t>
             </w:r>
             <w:r>
               <w:t>, and §2A is retained as the record of the earlier run</w:t>
@@ -285,7 +285,7 @@
               <w:t>five</w:t>
             </w:r>
             <w:r>
-              <w:t xml:space="preserve"> more — one of them the first pass's own fix applied too narrowly — and all five are fixed. </w:t>
+              <w:t xml:space="preserve"> more - one of them the first pass's own fix applied too narrowly - and all five are fixed. </w:t>
             </w:r>
             <w:r>
               <w:rPr>
@@ -321,7 +321,7 @@
         <w:pStyle w:val="Heading2"/>
       </w:pPr>
       <w:r>
-        <w:t>1. Scope — read this before anything else</w:t>
+        <w:t>1. Scope - read this before anything else</w:t>
       </w:r>
     </w:p>
     <w:p>
@@ -332,7 +332,7 @@
         <w:t>This report has been through two passes, and the second one had no database.</w:t>
       </w:r>
       <w:r>
-        <w:t xml:space="preserve"> Pass 1 began as a static audit and became a partial live run: the owner confirmed a Supabase project as disposable, and §2A records what happened when the plan was executed against it — Step 0, 230 automated cases, the webhook suite and the anonymous-API sweep.</w:t>
+        <w:t xml:space="preserve"> Pass 1 began as a static audit and became a partial live run: the owner confirmed a Supabase project as disposable, and §2A records what happened when the plan was executed against it - Step 0, 230 automated cases, the webhook suite and the anonymous-API sweep.</w:t>
       </w:r>
     </w:p>
     <w:p>
@@ -343,7 +343,7 @@
         <w:t>Pass 2 (this issue) re-audited the current branch head with no live environment at all.</w:t>
       </w:r>
       <w:r>
-        <w:t xml:space="preserve"> What it could do, it did: the four commands ran and their real output is quoted below; every pass-1 finding was re-checked against the code and schema that fix it; and the areas that changed since pass 1 — the Settings split, three access levels, the four scoped dashboards, the whole-hour slot rule, the category reorder, the promo/invite/free-booking paths — were traced afresh. </w:t>
+        <w:t xml:space="preserve"> What it could do, it did: the four commands ran and their real output is quoted below; every pass-1 finding was re-checked against the code and schema that fix it; and the areas that changed since pass 1 - the Settings split, three access levels, the four scoped dashboards, the whole-hour slot rule, the category reorder, the promo/invite/free-booking paths - were traced afresh. </w:t>
       </w:r>
       <w:r>
         <w:rPr>
@@ -363,7 +363,7 @@
         <w:t>It is still not a complete execution of the plan</w:t>
       </w:r>
       <w:r>
-        <w:t xml:space="preserve"> — the sections needing a browser with outbound network, a human at a payment widget, or a schema-apply token remain unrun, and §5 says which. Nothing here is reported as passing on the strength of reading code: every claim is either an EXECUTED result with its output, or a VERIFIED-SOURCE trace, or is marked NOT-VERIFIABLE.</w:t>
+        <w:t xml:space="preserve"> - the sections needing a browser with outbound network, a human at a payment widget, or a schema-apply token remain unrun, and §5 says which. Nothing here is reported as passing on the strength of reading code: every claim is either an EXECUTED result with its output, or a VERIFIED-SOURCE trace, or is marked NOT-VERIFIABLE.</w:t>
       </w:r>
     </w:p>
     <w:p>
@@ -609,7 +609,7 @@
         <w:t>Nothing is marked passed on the strength of reading code.</w:t>
       </w:r>
       <w:r>
-        <w:t xml:space="preserve"> VERIFIED-SOURCE means "the mechanism is present and is the one the plan describes" — it does not mean the screen works.</w:t>
+        <w:t xml:space="preserve"> VERIFIED-SOURCE means "the mechanism is present and is the one the plan describes" - it does not mean the screen works.</w:t>
       </w:r>
     </w:p>
     <w:p>
@@ -869,7 +869,7 @@
               <w:t>check:realtime</w:t>
             </w:r>
             <w:r>
-              <w:t xml:space="preserve"> — 40 subscribed tables, all published</w:t>
+              <w:t xml:space="preserve"> - 40 subscribed tables, all published</w:t>
             </w:r>
           </w:p>
         </w:tc>
@@ -1010,7 +1010,7 @@
         <w:t>23 files, 384 tests, 0 failures</w:t>
       </w:r>
       <w:r>
-        <w:t>, in 2.6 seconds. The growth from 187 is the work merged between the two passes — the discounts, promo-code, invite, checkout-quote, care-plan-review, admin-home and admin-scope modules all arrived with their own tests, which is the pattern the first pass asked for when it raised F-06.</w:t>
+        <w:t>, in 2.6 seconds. The growth from 187 is the work merged between the two passes - the discounts, promo-code, invite, checkout-quote, care-plan-review, admin-home and admin-scope modules all arrived with their own tests, which is the pattern the first pass asked for when it raised F-06.</w:t>
       </w:r>
     </w:p>
     <w:p>
@@ -1031,7 +1031,7 @@
         <w:t>src/lib</w:t>
       </w:r>
       <w:r>
-        <w:t xml:space="preserve"> — the roster's range↔hour conversion, the home-visit price and payout maths, the contact-leak scanner's two tiers, phone/email masking, the settings parser, the care-plan rules and the consultation-first rule. That is genuine coverage of the business arithmetic the finance and clinical sections of the plan depend on.</w:t>
+        <w:t xml:space="preserve"> - the roster's range↔hour conversion, the home-visit price and payout maths, the contact-leak scanner's two tiers, phone/email masking, the settings parser, the care-plan rules and the consultation-first rule. That is genuine coverage of the business arithmetic the finance and clinical sections of the plan depend on.</w:t>
       </w:r>
     </w:p>
     <w:p>
@@ -1055,7 +1055,7 @@
         <w:t>adminMetrics.ts</w:t>
       </w:r>
       <w:r>
-        <w:t xml:space="preserve"> — the module holding </w:t>
+        <w:t xml:space="preserve"> - the module holding </w:t>
       </w:r>
       <w:r>
         <w:rPr>
@@ -1111,14 +1111,14 @@
           <w:rFonts w:ascii="Consolas" w:hAnsi="Consolas"/>
           <w:sz w:val="17"/>
         </w:rPr>
-        <w:t>Realtime coverage OK — 40 subscribed table(s), all published.</w:t>
+        <w:t>Realtime coverage OK - 40 subscribed table(s), all published.</w:t>
         <w:br/>
         <w:t>(1 published but unsubscribed: home_visit_purchase_events)</w:t>
       </w:r>
     </w:p>
     <w:p>
       <w:r>
-        <w:t>The unsubscribed table is benign — a publication entry with no subscriber costs nothing. The check exists to catch the opposite case (a subscribed table that was never published), which has no runtime symptom at all: the subscription succeeds and simply never fires.</w:t>
+        <w:t>The unsubscribed table is benign - a publication entry with no subscriber costs nothing. The check exists to catch the opposite case (a subscribed table that was never published), which has no runtime symptom at all: the subscription succeeds and simply never fires.</w:t>
       </w:r>
     </w:p>
     <w:p>
@@ -1270,7 +1270,7 @@
               <w:t>two</w:t>
             </w:r>
             <w:r>
-              <w:t xml:space="preserve"> places — proxy for navigation, </w:t>
+              <w:t xml:space="preserve"> places - proxy for navigation, </w:t>
             </w:r>
             <w:r>
               <w:rPr>
@@ -1405,7 +1405,7 @@
           <w:p>
             <w:r/>
             <w:r>
-              <w:t>One account, one role — a therapist cannot book</w:t>
+              <w:t>One account, one role - a therapist cannot book</w:t>
             </w:r>
           </w:p>
         </w:tc>
@@ -1637,7 +1637,7 @@
               <w:rPr>
                 <w:b/>
               </w:rPr>
-              <w:t>VERIFIED-SOURCE — with a correction</w:t>
+              <w:t>VERIFIED-SOURCE - with a correction</w:t>
             </w:r>
           </w:p>
         </w:tc>
@@ -1788,7 +1788,7 @@
               <w:t>set-admin-scope/route.ts</w:t>
             </w:r>
             <w:r>
-              <w:t xml:space="preserve"> — all three guards present</w:t>
+              <w:t xml:space="preserve"> - all three guards present</w:t>
             </w:r>
           </w:p>
         </w:tc>
@@ -3724,7 +3724,7 @@
               <w:t>carePlans.test.ts</w:t>
             </w:r>
             <w:r>
-              <w:t xml:space="preserve"> — 20 tests pass</w:t>
+              <w:t xml:space="preserve"> - 20 tests pass</w:t>
             </w:r>
           </w:p>
         </w:tc>
@@ -4153,7 +4153,7 @@
               <w:t>availabilityRanges.test.ts</w:t>
             </w:r>
             <w:r>
-              <w:t xml:space="preserve"> — 41 tests pass</w:t>
+              <w:t xml:space="preserve"> - 41 tests pass</w:t>
             </w:r>
           </w:p>
         </w:tc>
@@ -4198,7 +4198,7 @@
               <w:t>availabilityRequest.test.ts</w:t>
             </w:r>
             <w:r>
-              <w:t xml:space="preserve"> — 16 tests pass</w:t>
+              <w:t xml:space="preserve"> - 16 tests pass</w:t>
             </w:r>
           </w:p>
         </w:tc>
@@ -4844,7 +4844,7 @@
               <w:rPr>
                 <w:b/>
               </w:rPr>
-              <w:t>PARTIAL — see F-03</w:t>
+              <w:t>PARTIAL - see F-03</w:t>
             </w:r>
           </w:p>
         </w:tc>
@@ -4987,7 +4987,7 @@
               <w:t>contactLeakScan.test.ts</w:t>
             </w:r>
             <w:r>
-              <w:t xml:space="preserve"> — 33 tests pass</w:t>
+              <w:t xml:space="preserve"> - 33 tests pass</w:t>
             </w:r>
           </w:p>
         </w:tc>
@@ -5032,7 +5032,7 @@
               <w:t>contactMasking.test.ts</w:t>
             </w:r>
             <w:r>
-              <w:t xml:space="preserve"> — 13 tests pass</w:t>
+              <w:t xml:space="preserve"> - 13 tests pass</w:t>
             </w:r>
           </w:p>
         </w:tc>
@@ -5123,7 +5123,7 @@
               <w:t>reveal-contact</w:t>
             </w:r>
             <w:r>
-              <w:t xml:space="preserve"> returns 500 when the log insert fails — not best-effort</w:t>
+              <w:t xml:space="preserve"> returns 500 when the log insert fails - not best-effort</w:t>
             </w:r>
           </w:p>
         </w:tc>
@@ -5396,7 +5396,7 @@
           <w:p>
             <w:r/>
             <w:r>
-              <w:t xml:space="preserve">Computed as that difference — the identity holds </w:t>
+              <w:t xml:space="preserve">Computed as that difference - the identity holds </w:t>
             </w:r>
             <w:r>
               <w:rPr>
@@ -5708,7 +5708,7 @@
               <w:t>homeVisitPricing.test.ts</w:t>
             </w:r>
             <w:r>
-              <w:t xml:space="preserve"> — 11 tests pass</w:t>
+              <w:t xml:space="preserve"> - 11 tests pass</w:t>
             </w:r>
           </w:p>
         </w:tc>
@@ -5887,7 +5887,7 @@
               <w:t>31 screens</w:t>
             </w:r>
             <w:r>
-              <w:t>, not the 28 of pass 1, and the plan said 28 in three places — see F-12</w:t>
+              <w:t>, not the 28 of pass 1, and the plan said 28 in three places - see F-12</w:t>
             </w:r>
           </w:p>
         </w:tc>
@@ -5924,7 +5924,7 @@
               <w:rPr>
                 <w:b/>
               </w:rPr>
-              <w:t>VERIFIED-SOURCE — clean</w:t>
+              <w:t>VERIFIED-SOURCE - clean</w:t>
             </w:r>
           </w:p>
         </w:tc>
@@ -5990,7 +5990,7 @@
               <w:rPr>
                 <w:b/>
               </w:rPr>
-              <w:t>WAS FALSE — now true</w:t>
+              <w:t>WAS FALSE - now true</w:t>
             </w:r>
           </w:p>
         </w:tc>
@@ -6136,7 +6136,7 @@
               <w:t>and</w:t>
             </w:r>
             <w:r>
-              <w:t xml:space="preserve"> both admin detail contents — 8 call sites</w:t>
+              <w:t xml:space="preserve"> both admin detail contents - 8 call sites</w:t>
             </w:r>
           </w:p>
         </w:tc>
@@ -6163,7 +6163,7 @@
               <w:rPr>
                 <w:b/>
               </w:rPr>
-              <w:t>PLAN WAS WRONG — corrected</w:t>
+              <w:t>PLAN WAS WRONG - corrected</w:t>
             </w:r>
           </w:p>
         </w:tc>
@@ -6211,7 +6211,7 @@
     </w:p>
     <w:p>
       <w:r>
-        <w:t>Everything in this table was traced for the first time in pass 2, because it did not exist — or did not have this shape — when the first audit ran.</w:t>
+        <w:t>Everything in this table was traced for the first time in pass 2, because it did not exist - or did not have this shape - when the first audit ran.</w:t>
       </w:r>
     </w:p>
     <w:tbl>
@@ -6354,7 +6354,7 @@
               <w:t>requireAdmin.ts:97</w:t>
             </w:r>
             <w:r>
-              <w:t xml:space="preserve"> — </w:t>
+              <w:t xml:space="preserve"> - </w:t>
             </w:r>
             <w:r>
               <w:rPr>
@@ -6416,7 +6416,7 @@
               <w:t>adminScope.ts:98</w:t>
             </w:r>
             <w:r>
-              <w:t xml:space="preserve"> — </w:t>
+              <w:t xml:space="preserve"> - </w:t>
             </w:r>
             <w:r>
               <w:rPr>
@@ -6620,7 +6620,7 @@
               <w:t>9</w:t>
             </w:r>
             <w:r>
-              <w:t xml:space="preserve"> route handlers — the nine the plan names — and by no component that could be bypassed</w:t>
+              <w:t xml:space="preserve"> route handlers - the nine the plan names - and by no component that could be bypassed</w:t>
             </w:r>
           </w:p>
         </w:tc>
@@ -6877,7 +6877,7 @@
               <w:t>recordPaymentCapture.ts</w:t>
             </w:r>
             <w:r>
-              <w:t xml:space="preserve"> from the three verify routes and the webhook — 9 references, no fourth fulfilment path</w:t>
+              <w:t xml:space="preserve"> from the three verify routes and the webhook - 9 references, no fourth fulfilment path</w:t>
             </w:r>
           </w:p>
         </w:tc>
@@ -6928,7 +6928,7 @@
               <w:t>webhook/route.ts:50</w:t>
             </w:r>
             <w:r>
-              <w:t xml:space="preserve"> — </w:t>
+              <w:t xml:space="preserve"> - </w:t>
             </w:r>
             <w:r>
               <w:rPr>
@@ -7060,7 +7060,7 @@
               <w:t>no policy at all</w:t>
             </w:r>
             <w:r>
-              <w:t xml:space="preserve"> — deny-all to any browser session, reachable only by the service role. That is the intended shape for a server-only table, not a gap</w:t>
+              <w:t xml:space="preserve"> - deny-all to any browser session, reachable only by the service role. That is the intended shape for a server-only table, not a gap</w:t>
             </w:r>
           </w:p>
         </w:tc>
@@ -7197,7 +7197,7 @@
               <w:t>risk_rules</w:t>
             </w:r>
             <w:r>
-              <w:t>, all three deliberate — the first is what the reset preserves, the other two are reset to defaults rather than emptied</w:t>
+              <w:t>, all three deliberate - the first is what the reset preserves, the other two are reset to defaults rather than emptied</w:t>
             </w:r>
           </w:p>
         </w:tc>
@@ -7287,7 +7287,7 @@
               <w:t>Clean</w:t>
             </w:r>
             <w:r>
-              <w:t xml:space="preserve">, after F-12 — the four remaining </w:t>
+              <w:t xml:space="preserve">, after F-12 - the four remaining </w:t>
             </w:r>
             <w:r>
               <w:rPr>
@@ -7328,7 +7328,7 @@
         <w:t>This section is pass 1's record, dated 2 September 2026, and was not re-run in pass 2.</w:t>
       </w:r>
       <w:r>
-        <w:t xml:space="preserve"> No live environment was available for the second pass, so nothing below is evidence about the current branch head — read it as what a live run established about the product on that date, against a database that did </w:t>
+        <w:t xml:space="preserve"> No live environment was available for the second pass, so nothing below is evidence about the current branch head - read it as what a live run established about the product on that date, against a database that did </w:t>
       </w:r>
       <w:r>
         <w:rPr>
@@ -7477,7 +7477,7 @@
               <w:t>rzp_test_…</w:t>
             </w:r>
             <w:r>
-              <w:t xml:space="preserve"> — </w:t>
+              <w:t xml:space="preserve"> - </w:t>
             </w:r>
             <w:r>
               <w:rPr>
@@ -7581,7 +7581,7 @@
               <w:rPr>
                 <w:b/>
               </w:rPr>
-              <w:t>Absent — and this is the one consequential gap.</w:t>
+              <w:t>Absent - and this is the one consequential gap.</w:t>
             </w:r>
             <w:r>
               <w:t xml:space="preserve"> </w:t>
@@ -7619,7 +7619,7 @@
         <w:t>site_settings.auto_assign_therapist_enabled</w:t>
       </w:r>
       <w:r>
-        <w:t xml:space="preserve"> does not exist there, which means the auto-assign feature reads its setting, fails closed, and stays off — the designed behaviour for an unmigrated database, and confirmation that the fail-closed default is the right one. It also means the database still holds the </w:t>
+        <w:t xml:space="preserve"> does not exist there, which means the auto-assign feature reads its setting, fails closed, and stays off - the designed behaviour for an unmigrated database, and confirmation that the fail-closed default is the right one. It also means the database still holds the </w:t>
       </w:r>
       <w:r>
         <w:rPr>
@@ -7785,7 +7785,7 @@
           <w:p>
             <w:r/>
             <w:r>
-              <w:t>Cleared, by CASCADE — as the static analysis predicted</w:t>
+              <w:t>Cleared, by CASCADE - as the static analysis predicted</w:t>
             </w:r>
           </w:p>
         </w:tc>
@@ -8129,7 +8129,7 @@
         <w:t>risk_reviews</w:t>
       </w:r>
       <w:r>
-        <w:t xml:space="preserve"> were already empty, so they are inconclusive by measurement — but </w:t>
+        <w:t xml:space="preserve"> were already empty, so they are inconclusive by measurement - but </w:t>
       </w:r>
       <w:r>
         <w:rPr>
@@ -8529,7 +8529,7 @@
               <w:rPr>
                 <w:b/>
               </w:rPr>
-              <w:t>1 failed (real — see F-07)</w:t>
+              <w:t>1 failed (real - see F-07)</w:t>
             </w:r>
             <w:r>
               <w:t>, 1 skipped</w:t>
@@ -8676,7 +8676,7 @@
         <w:t>admin-degraded-schema.spec.ts</w:t>
       </w:r>
       <w:r>
-        <w:t xml:space="preserve"> — it drops columns and tables and restores them by re-applying </w:t>
+        <w:t xml:space="preserve"> - it drops columns and tables and restores them by re-applying </w:t>
       </w:r>
       <w:r>
         <w:rPr>
@@ -8717,7 +8717,7 @@
         <w:t>admin-login.spec.ts</w:t>
       </w:r>
       <w:r>
-        <w:t xml:space="preserve"> — skips itself unless a second app instance is running against the local Supabase relay.</w:t>
+        <w:t xml:space="preserve"> - skips itself unless a second app instance is running against the local Supabase relay.</w:t>
       </w:r>
     </w:p>
     <w:p>
@@ -8829,7 +8829,7 @@
               <w:rPr>
                 <w:b/>
               </w:rPr>
-              <w:t>REAL — now fixed (F-07)</w:t>
+              <w:t>REAL - now fixed (F-07)</w:t>
             </w:r>
           </w:p>
         </w:tc>
@@ -9286,7 +9286,7 @@
               <w:t>400</w:t>
             </w:r>
             <w:r>
-              <w:t xml:space="preserve"> — the raw-body check works, and is the reason a legitimate webhook must never be "fixed" by relaxing it</w:t>
+              <w:t xml:space="preserve"> - the raw-body check works, and is the reason a legitimate webhook must never be "fixed" by relaxing it</w:t>
             </w:r>
           </w:p>
         </w:tc>
@@ -9423,7 +9423,7 @@
               <w:t>200</w:t>
             </w:r>
             <w:r>
-              <w:t>, which is required — an error would have Razorpay retry forever</w:t>
+              <w:t>, which is required - an error would have Razorpay retry forever</w:t>
             </w:r>
           </w:p>
         </w:tc>
@@ -9474,7 +9474,7 @@
         <w:t>no response body leaks a table name, a column name, a row id or a stack trace</w:t>
       </w:r>
       <w:r>
-        <w:t>. Getting there took a fix — see F-08.</w:t>
+        <w:t>. Getting there took a fix - see F-08.</w:t>
       </w:r>
     </w:p>
     <w:p>
@@ -9798,7 +9798,7 @@
               <w:t>alter table risk_reviews alter column reviewer_id drop not null</w:t>
             </w:r>
             <w:r>
-              <w:t xml:space="preserve"> present — </w:t>
+              <w:t xml:space="preserve"> present - </w:t>
             </w:r>
             <w:r>
               <w:rPr>
@@ -10307,7 +10307,7 @@
               <w:t>Fixed</w:t>
             </w:r>
             <w:r>
-              <w:t xml:space="preserve"> — all named in the TRUNCATE list; </w:t>
+              <w:t xml:space="preserve"> - all named in the TRUNCATE list; </w:t>
             </w:r>
             <w:r>
               <w:rPr>
@@ -10376,7 +10376,7 @@
               <w:t>Fixed</w:t>
             </w:r>
             <w:r>
-              <w:t xml:space="preserve"> — column made nullable</w:t>
+              <w:t xml:space="preserve"> - column made nullable</w:t>
             </w:r>
           </w:p>
         </w:tc>
@@ -10435,7 +10435,7 @@
               <w:t>Fixed</w:t>
             </w:r>
             <w:r>
-              <w:t xml:space="preserve"> — trigger attached</w:t>
+              <w:t xml:space="preserve"> - trigger attached</w:t>
             </w:r>
           </w:p>
         </w:tc>
@@ -10487,7 +10487,7 @@
               <w:t>Fixed</w:t>
             </w:r>
             <w:r>
-              <w:t xml:space="preserve"> — plan corrected</w:t>
+              <w:t xml:space="preserve"> - plan corrected</w:t>
             </w:r>
           </w:p>
         </w:tc>
@@ -10539,7 +10539,7 @@
               <w:t>Fixed</w:t>
             </w:r>
             <w:r>
-              <w:t xml:space="preserve"> — plan corrected</w:t>
+              <w:t xml:space="preserve"> - plan corrected</w:t>
             </w:r>
           </w:p>
         </w:tc>
@@ -10591,7 +10591,7 @@
               <w:t>Fixed</w:t>
             </w:r>
             <w:r>
-              <w:t xml:space="preserve"> — </w:t>
+              <w:t xml:space="preserve"> - </w:t>
             </w:r>
             <w:r>
               <w:rPr>
@@ -10653,7 +10653,7 @@
               <w:t>Fixed</w:t>
             </w:r>
             <w:r>
-              <w:t xml:space="preserve"> — found by the repo's own test during the live run</w:t>
+              <w:t xml:space="preserve"> - found by the repo's own test during the live run</w:t>
             </w:r>
           </w:p>
         </w:tc>
@@ -10705,7 +10705,7 @@
               <w:t>Fixed</w:t>
             </w:r>
             <w:r>
-              <w:t xml:space="preserve"> — auth hoisted above validation</w:t>
+              <w:t xml:space="preserve"> - auth hoisted above validation</w:t>
             </w:r>
           </w:p>
         </w:tc>
@@ -10764,7 +10764,7 @@
               <w:t>Fixed</w:t>
             </w:r>
             <w:r>
-              <w:t xml:space="preserve"> — column made nullable</w:t>
+              <w:t xml:space="preserve"> - column made nullable</w:t>
             </w:r>
           </w:p>
         </w:tc>
@@ -10816,7 +10816,7 @@
               <w:t>Fixed</w:t>
             </w:r>
             <w:r>
-              <w:t xml:space="preserve"> — hoisted in all 28, sweep now returns 0</w:t>
+              <w:t xml:space="preserve"> - hoisted in all 28, sweep now returns 0</w:t>
             </w:r>
           </w:p>
         </w:tc>
@@ -10868,7 +10868,7 @@
               <w:t>Fixed</w:t>
             </w:r>
             <w:r>
-              <w:t xml:space="preserve"> — 23 new actions, one per route, sweep now returns 0</w:t>
+              <w:t xml:space="preserve"> - 23 new actions, one per route, sweep now returns 0</w:t>
             </w:r>
           </w:p>
         </w:tc>
@@ -10920,7 +10920,7 @@
               <w:t>Fixed</w:t>
             </w:r>
             <w:r>
-              <w:t xml:space="preserve"> — cases written, quotes and counts corrected</w:t>
+              <w:t xml:space="preserve"> - cases written, quotes and counts corrected</w:t>
             </w:r>
           </w:p>
         </w:tc>
@@ -10972,7 +10972,7 @@
               <w:t>Fixed</w:t>
             </w:r>
             <w:r>
-              <w:t xml:space="preserve"> — points at the route</w:t>
+              <w:t xml:space="preserve"> - points at the route</w:t>
             </w:r>
           </w:p>
         </w:tc>
@@ -10989,7 +10989,7 @@
         <w:pStyle w:val="Heading3"/>
       </w:pPr>
       <w:r>
-        <w:t xml:space="preserve">F-01 — The data reset does not clear four tables, and one of them silently suppresses future test results · </w:t>
+        <w:t xml:space="preserve">F-01 - The data reset does not clear four tables, and one of them silently suppresses future test results · </w:t>
       </w:r>
       <w:r>
         <w:rPr>
@@ -11054,7 +11054,7 @@
         <w:rPr>
           <w:i/>
         </w:rPr>
-        <w:t xml:space="preserve"> — people, sessions, purchases, catalog, settings. Admin logins survive. No undo."</w:t>
+        <w:t xml:space="preserve"> - people, sessions, purchases, catalog, settings. Admin logins survive. No undo."</w:t>
       </w:r>
       <w:r>
         <w:t xml:space="preserve"> </w:t>
@@ -11252,7 +11252,7 @@
               <w:t>Yes</w:t>
             </w:r>
             <w:r>
-              <w:t xml:space="preserve"> — by CASCADE</w:t>
+              <w:t xml:space="preserve"> - by CASCADE</w:t>
             </w:r>
           </w:p>
         </w:tc>
@@ -11328,7 +11328,7 @@
               <w:t>Yes</w:t>
             </w:r>
             <w:r>
-              <w:t xml:space="preserve"> — by CASCADE</w:t>
+              <w:t xml:space="preserve"> - by CASCADE</w:t>
             </w:r>
           </w:p>
         </w:tc>
@@ -11404,7 +11404,7 @@
               <w:t>Yes</w:t>
             </w:r>
             <w:r>
-              <w:t xml:space="preserve"> — by CASCADE</w:t>
+              <w:t xml:space="preserve"> - by CASCADE</w:t>
             </w:r>
           </w:p>
         </w:tc>
@@ -11494,7 +11494,7 @@
               <w:t>on delete set null</w:t>
             </w:r>
             <w:r>
-              <w:t xml:space="preserve"> — so neither the TRUNCATE nor the </w:t>
+              <w:t xml:space="preserve"> - so neither the TRUNCATE nor the </w:t>
             </w:r>
             <w:r>
               <w:rPr>
@@ -11738,7 +11738,7 @@
         <w:t>is</w:t>
       </w:r>
       <w:r>
-        <w:t xml:space="preserve"> in the list despite also being added later, so the list has been maintained for the roster work — the care-plan, evidence and risk tables were simply missed.</w:t>
+        <w:t xml:space="preserve"> in the list despite also being added later, so the list has been maintained for the roster work - the care-plan, evidence and risk tables were simply missed.</w:t>
       </w:r>
     </w:p>
     <w:p>
@@ -11826,7 +11826,7 @@
         <w:t>there is no way to clear these rows short of adding the table to the TRUNCATE list</w:t>
       </w:r>
       <w:r>
-        <w:t xml:space="preserve"> — a row delete is refused by design.</w:t>
+        <w:t xml:space="preserve"> - a row delete is refused by design.</w:t>
       </w:r>
     </w:p>
     <w:p>
@@ -11888,7 +11888,7 @@
         <w:t>ADM-RISK-001</w:t>
       </w:r>
       <w:r>
-        <w:t xml:space="preserve"> on a "clean" database sees an empty queue and reports a broken detector. This is exactly the leftover-state trap the plan warns about in §6.1 — except the plan tells the tester the reset protects them from it.</w:t>
+        <w:t xml:space="preserve"> on a "clean" database sees an empty queue and reports a broken detector. This is exactly the leftover-state trap the plan warns about in §6.1 - except the plan tells the tester the reset protects them from it.</w:t>
       </w:r>
     </w:p>
     <w:p>
@@ -11979,7 +11979,7 @@
         <w:t>site_settings</w:t>
       </w:r>
       <w:r>
-        <w:t xml:space="preserve"> is — but do not leave it in its current state, where an edited threshold survives a wipe with nothing telling anyone.</w:t>
+        <w:t xml:space="preserve"> is - but do not leave it in its current state, where an edited threshold survives a wipe with nothing telling anyone.</w:t>
       </w:r>
     </w:p>
     <w:p>
@@ -12061,7 +12061,7 @@
         <w:t>schema.sql</w:t>
       </w:r>
       <w:r>
-        <w:t xml:space="preserve"> (the file's append-only convention — later definitions win). </w:t>
+        <w:t xml:space="preserve"> (the file's append-only convention - later definitions win). </w:t>
       </w:r>
       <w:r>
         <w:rPr>
@@ -12150,7 +12150,7 @@
         <w:t>not</w:t>
       </w:r>
       <w:r>
-        <w:t xml:space="preserve"> truncated — it is configuration, like </w:t>
+        <w:t xml:space="preserve"> truncated - it is configuration, like </w:t>
       </w:r>
       <w:r>
         <w:rPr>
@@ -12160,7 +12160,7 @@
         <w:t>site_settings</w:t>
       </w:r>
       <w:r>
-        <w:t xml:space="preserve"> — and is instead reset to its seeded defaults, because an empty </w:t>
+        <w:t xml:space="preserve"> - and is instead reset to its seeded defaults, because an empty </w:t>
       </w:r>
       <w:r>
         <w:rPr>
@@ -12193,7 +12193,7 @@
         <w:pStyle w:val="Heading3"/>
       </w:pPr>
       <w:r>
-        <w:t xml:space="preserve">F-02 — </w:t>
+        <w:t xml:space="preserve">F-02 - </w:t>
       </w:r>
       <w:r>
         <w:rPr>
@@ -12314,7 +12314,7 @@
         <w:t>NOT NULL</w:t>
       </w:r>
       <w:r>
-        <w:t xml:space="preserve"> constraint refuses — so </w:t>
+        <w:t xml:space="preserve"> constraint refuses - so </w:t>
       </w:r>
       <w:r>
         <w:rPr>
@@ -12382,7 +12382,7 @@
         <w:t>the entire reset transaction aborts</w:t>
       </w:r>
       <w:r>
-        <w:t xml:space="preserve"> — leaving a half-tested database and an error a tester will not be able to interpret.</w:t>
+        <w:t xml:space="preserve"> - leaving a half-tested database and an error a tester will not be able to interpret.</w:t>
       </w:r>
     </w:p>
     <w:p>
@@ -12434,7 +12434,7 @@
         <w:t>alter table risk_reviews alter column reviewer_id drop not null</w:t>
       </w:r>
       <w:r>
-        <w:t xml:space="preserve">. A review outliving its reviewer is the intended reading — the same posture </w:t>
+        <w:t xml:space="preserve">. A review outliving its reviewer is the intended reading - the same posture </w:t>
       </w:r>
       <w:r>
         <w:rPr>
@@ -12467,7 +12467,7 @@
         <w:pStyle w:val="Heading3"/>
       </w:pPr>
       <w:r>
-        <w:t xml:space="preserve">F-03 — </w:t>
+        <w:t xml:space="preserve">F-03 - </w:t>
       </w:r>
       <w:r>
         <w:rPr>
@@ -12665,7 +12665,7 @@
         <w:t>communication_evidence_is_append_only()</w:t>
       </w:r>
       <w:r>
-        <w:t xml:space="preserve"> trigger function — it already raises with the table's own name — and attach it to </w:t>
+        <w:t xml:space="preserve"> trigger function - it already raises with the table's own name - and attach it to </w:t>
       </w:r>
       <w:r>
         <w:rPr>
@@ -12719,7 +12719,7 @@
         <w:pStyle w:val="Heading3"/>
       </w:pPr>
       <w:r>
-        <w:t xml:space="preserve">F-04 — The plan overstates the admin scope guard (documentation defect) · </w:t>
+        <w:t xml:space="preserve">F-04 - The plan overstates the admin scope guard (documentation defect) · </w:t>
       </w:r>
       <w:r>
         <w:rPr>
@@ -13071,7 +13071,7 @@
         <w:t>Impact.</w:t>
       </w:r>
       <w:r>
-        <w:t xml:space="preserve"> No security impact — the exceptions are tighter than the rule. The defect is in the test plan: a tester reading §4.4 literally would file these three as violations. Correct the plan to state the rule as "every admin route guards on scope; three guard on </w:t>
+        <w:t xml:space="preserve"> No security impact - the exceptions are tighter than the rule. The defect is in the test plan: a tester reading §4.4 literally would file these three as violations. Correct the plan to state the rule as "every admin route guards on scope; three guard on </w:t>
       </w:r>
       <w:r>
         <w:rPr>
@@ -13105,7 +13105,7 @@
         <w:pStyle w:val="Heading3"/>
       </w:pPr>
       <w:r>
-        <w:t xml:space="preserve">F-05 — The plan asserted a row cap on All Sessions that no longer exists (documentation defect) · </w:t>
+        <w:t xml:space="preserve">F-05 - The plan asserted a row cap on All Sessions that no longer exists (documentation defect) · </w:t>
       </w:r>
       <w:r>
         <w:rPr>
@@ -13203,7 +13203,7 @@
         <w:t>AGENTS.md</w:t>
       </w:r>
       <w:r>
-        <w:t xml:space="preserve"> records the change explicitly — </w:t>
+        <w:t xml:space="preserve"> records the change explicitly - </w:t>
       </w:r>
       <w:r>
         <w:rPr>
@@ -13236,7 +13236,7 @@
         <w:pStyle w:val="Heading3"/>
       </w:pPr>
       <w:r>
-        <w:t xml:space="preserve">F-06 — The revenue split has no unit test · </w:t>
+        <w:t xml:space="preserve">F-06 - The revenue split has no unit test · </w:t>
       </w:r>
       <w:r>
         <w:rPr>
@@ -13295,7 +13295,7 @@
         <w:t>There is no `adminMetrics.test.ts`.</w:t>
       </w:r>
       <w:r>
-        <w:t xml:space="preserve"> The nine test files cover the roster, home-visit pricing, the scanner, masking, settings, risk vocabulary, care plans and the consultation rule — every dependency-free module in </w:t>
+        <w:t xml:space="preserve"> The nine test files cover the roster, home-visit pricing, the scanner, masking, settings, risk vocabulary, care plans and the consultation rule - every dependency-free module in </w:t>
       </w:r>
       <w:r>
         <w:rPr>
@@ -13328,7 +13328,7 @@
     </w:p>
     <w:p>
       <w:r>
-        <w:t xml:space="preserve">This is not a defect — the current implementation reads correctly, and the identities hold by construction because the clinic share is computed as the difference rather than accumulated independently. It is the </w:t>
+        <w:t xml:space="preserve">This is not a defect - the current implementation reads correctly, and the identities hold by construction because the clinic share is computed as the difference rather than accumulated independently. It is the </w:t>
       </w:r>
       <w:r>
         <w:rPr>
@@ -13358,7 +13358,7 @@
         <w:t>src/lib/adminMetrics.test.ts</w:t>
       </w:r>
       <w:r>
-        <w:t xml:space="preserve"> — </w:t>
+        <w:t xml:space="preserve"> - </w:t>
       </w:r>
       <w:r>
         <w:rPr>
@@ -13407,7 +13407,7 @@
         <w:pStyle w:val="ListBullet"/>
       </w:pPr>
       <w:r>
-        <w:t>"not referred" and "referred but unconfigured" stay apart — same money, opposite treatment;</w:t>
+        <w:t>"not referred" and "referred but unconfigured" stay apart - same money, opposite treatment;</w:t>
       </w:r>
     </w:p>
     <w:p>
@@ -13458,7 +13458,7 @@
         <w:t>computeRepeatBookingRate</w:t>
       </w:r>
       <w:r>
-        <w:t xml:space="preserve">) are covered too — including that they return </w:t>
+        <w:t xml:space="preserve">) are covered too - including that they return </w:t>
       </w:r>
       <w:r>
         <w:rPr>
@@ -13498,7 +13498,7 @@
         <w:t>adminMetrics.test.ts</w:t>
       </w:r>
       <w:r>
-        <w:t xml:space="preserve"> covering the §16.1 reference dataset: a completed paid session, a paid-but-not-completed one, a refunded one, a hospital-referred one, one with an unset therapist share, and a home visit with a travel fee — asserting both identities plus the excluded count. That dataset is already written and hand-computed in the plan; it converts directly into a test table. The manual finance tests then become a check on the </w:t>
+        <w:t xml:space="preserve"> covering the §16.1 reference dataset: a completed paid session, a paid-but-not-completed one, a refunded one, a hospital-referred one, one with an unset therapist share, and a home visit with a travel fee - asserting both identities plus the excluded count. That dataset is already written and hand-computed in the plan; it converts directly into a test table. The manual finance tests then become a check on the </w:t>
       </w:r>
       <w:r>
         <w:rPr>
@@ -13520,7 +13520,7 @@
         <w:pStyle w:val="Heading3"/>
       </w:pPr>
       <w:r>
-        <w:t xml:space="preserve">F-07 — </w:t>
+        <w:t xml:space="preserve">F-07 - </w:t>
       </w:r>
       <w:r>
         <w:rPr>
@@ -13575,7 +13575,7 @@
         <w:t>Class.</w:t>
       </w:r>
       <w:r>
-        <w:t xml:space="preserve"> EXECUTED — this one was caught by the repository's own test suite during the live run, not by reading code.</w:t>
+        <w:t xml:space="preserve"> EXECUTED - this one was caught by the repository's own test suite during the live run, not by reading code.</w:t>
       </w:r>
     </w:p>
     <w:p>
@@ -13665,7 +13665,7 @@
         <w:t>published</w:t>
       </w:r>
       <w:r>
-        <w:t xml:space="preserve"> — it passed, because this table was in neither list. H-006 checks that every table the dashboard </w:t>
+        <w:t xml:space="preserve"> - it passed, because this table was in neither list. H-006 checks that every table the dashboard </w:t>
       </w:r>
       <w:r>
         <w:rPr>
@@ -13705,7 +13705,7 @@
         <w:t>page.tsx:327</w:t>
       </w:r>
       <w:r>
-        <w:t>, and updated the reset function's TRUNCATE list for it — but not the realtime arrays. It predates the changes in this branch.</w:t>
+        <w:t>, and updated the reset function's TRUNCATE list for it - but not the realtime arrays. It predates the changes in this branch.</w:t>
       </w:r>
     </w:p>
     <w:p>
@@ -13726,7 +13726,7 @@
         <w:t>therapist_schedule_state</w:t>
       </w:r>
       <w:r>
-        <w:t xml:space="preserve"> to hand the roster editor the version its next save must match. Without a subscription, one admin saving a roster leaves a second admin's open dashboard holding a stale version — the compare-and-swap catches it, so nothing is corrupted, but the second admin gets a 409 telling them to reload where a live refresh would simply have happened. It is a papercut, not a correctness hole; it is a finding because the codebase's own stated rule is that a new table goes into one of the two arrays </w:t>
+        <w:t xml:space="preserve"> to hand the roster editor the version its next save must match. Without a subscription, one admin saving a roster leaves a second admin's open dashboard holding a stale version - the compare-and-swap catches it, so nothing is corrupted, but the second admin gets a 409 telling them to reload where a live refresh would simply have happened. It is a papercut, not a correctness hole; it is a finding because the codebase's own stated rule is that a new table goes into one of the two arrays </w:t>
       </w:r>
       <w:r>
         <w:rPr>
@@ -13766,7 +13766,7 @@
         <w:t>ADMIN_REALTIME_TABLES</w:t>
       </w:r>
       <w:r>
-        <w:t xml:space="preserve"> (the operational channel — a roster change is operational) and given the guarded </w:t>
+        <w:t xml:space="preserve"> (the operational channel - a roster change is operational) and given the guarded </w:t>
       </w:r>
       <w:r>
         <w:rPr>
@@ -13818,7 +13818,7 @@
         <w:pStyle w:val="Heading3"/>
       </w:pPr>
       <w:r>
-        <w:t xml:space="preserve">F-08 — Eleven routes validated the request body before checking who was asking · </w:t>
+        <w:t xml:space="preserve">F-08 - Eleven routes validated the request body before checking who was asking · </w:t>
       </w:r>
       <w:r>
         <w:rPr>
@@ -13918,7 +13918,7 @@
         <w:t>at all</w:t>
       </w:r>
       <w:r>
-        <w:t xml:space="preserve">, so the same 11 were re-called with well-formed bodies. Nine then returned 401/403. The two home-visit order routes validated more deeply first — </w:t>
+        <w:t xml:space="preserve">, so the same 11 were re-called with well-formed bodies. Nine then returned 401/403. The two home-visit order routes validated more deeply first - </w:t>
       </w:r>
       <w:r>
         <w:rPr>
@@ -13928,7 +13928,7 @@
         <w:t>{"error":"A street address is required."}</w:t>
       </w:r>
       <w:r>
-        <w:t xml:space="preserve"> — and only refused once a complete address was supplied. So </w:t>
+        <w:t xml:space="preserve"> - and only refused once a complete address was supplied. So </w:t>
       </w:r>
       <w:r>
         <w:rPr>
@@ -13951,7 +13951,7 @@
         <w:t>ordering</w:t>
       </w:r>
       <w:r>
-        <w:t xml:space="preserve"> defect, not a hole — which is why it is P3 and not higher. It is still worth fixing on two grounds: an unauthenticated caller should not drive a route's parsing at all, and the other ninety-odd routes in this application already check auth first, so these eleven were the inconsistent ones.</w:t>
+        <w:t xml:space="preserve"> defect, not a hole - which is why it is P3 and not higher. It is still worth fixing on two grounds: an unauthenticated caller should not drive a route's parsing at all, and the other ninety-odd routes in this application already check auth first, so these eleven were the inconsistent ones.</w:t>
       </w:r>
     </w:p>
     <w:p>
@@ -14033,7 +14033,7 @@
         <w:pStyle w:val="Heading3"/>
       </w:pPr>
       <w:r>
-        <w:t xml:space="preserve">F-09 — </w:t>
+        <w:t xml:space="preserve">F-09 - </w:t>
       </w:r>
       <w:r>
         <w:rPr>
@@ -14151,7 +14151,7 @@
         <w:t>"A scan of the whole schema found this is the only occurrence of the pattern."</w:t>
       </w:r>
       <w:r>
-        <w:t xml:space="preserve"> It was, on 2 September. The care-plan review step then shipped, its table was written from the older one, and the pattern came back — which is the ordinary way a fixed defect returns: not by being undone, but by being copied from something that predates the fix.</w:t>
+        <w:t xml:space="preserve"> It was, on 2 September. The care-plan review step then shipped, its table was written from the older one, and the pattern came back - which is the ordinary way a fixed defect returns: not by being undone, but by being copied from something that predates the fix.</w:t>
       </w:r>
     </w:p>
     <w:p>
@@ -14181,7 +14181,7 @@
         <w:t>delete raises</w:t>
       </w:r>
       <w:r>
-        <w:t xml:space="preserve"> and the reference is never cleared. The failure surfaces far from here — as an unrelated account deletion aborting with a message naming a table the person deleting has never heard of.</w:t>
+        <w:t xml:space="preserve"> and the reference is never cleared. The failure surfaces far from here - as an unrelated account deletion aborting with a message naming a table the person deleting has never heard of.</w:t>
       </w:r>
     </w:p>
     <w:p>
@@ -14231,7 +14231,7 @@
         <w:t>delete from auth.users</w:t>
       </w:r>
       <w:r>
-        <w:t xml:space="preserve"> runs, so the standard reset path cannot hit it. It needs an admin profile deleted outside a reset — and this product suspends rather than deletes, deliberately, so that is a hand-run statement rather than a screen.</w:t>
+        <w:t xml:space="preserve"> runs, so the standard reset path cannot hit it. It needs an admin profile deleted outside a reset - and this product suspends rather than deletes, deliberately, so that is a hand-run statement rather than a screen.</w:t>
       </w:r>
     </w:p>
     <w:p>
@@ -14333,7 +14333,7 @@
         <w:t>delete from profiles where id = '&lt;a reviewer&gt;'</w:t>
       </w:r>
       <w:r>
-        <w:t xml:space="preserve"> — it must not raise.</w:t>
+        <w:t xml:space="preserve"> - it must not raise.</w:t>
       </w:r>
     </w:p>
     <w:p>
@@ -14346,7 +14346,7 @@
         <w:pStyle w:val="Heading3"/>
       </w:pPr>
       <w:r>
-        <w:t xml:space="preserve">F-10 — F-08 was fixed in the eleven routes a probe reached, not in the class · </w:t>
+        <w:t xml:space="preserve">F-10 - F-08 was fixed in the eleven routes a probe reached, not in the class · </w:t>
       </w:r>
       <w:r>
         <w:rPr>
@@ -14421,7 +14421,7 @@
         <w:t>all 160</w:t>
       </w:r>
       <w:r>
-        <w:t xml:space="preserve"> route handlers this pass — comparing the line at which the body is first parsed against the line of the first authentication call — found </w:t>
+        <w:t xml:space="preserve"> route handlers this pass - comparing the line at which the body is first parsed against the line of the first authentication call - found </w:t>
       </w:r>
       <w:r>
         <w:rPr>
@@ -14529,7 +14529,7 @@
         <w:t>shape of the pass-1 fix</w:t>
       </w:r>
       <w:r>
-        <w:t>: the eleven were the instances the probe happened to reach, and fixing instances rather than the class leaves a rule that looks enforced — the sweep, not the probe, is what says whether it is.</w:t>
+        <w:t>: the eleven were the instances the probe happened to reach, and fixing instances rather than the class leaves a rule that looks enforced - the sweep, not the probe, is what says whether it is.</w:t>
       </w:r>
     </w:p>
     <w:p>
@@ -14652,7 +14652,7 @@
         <w:pStyle w:val="Heading3"/>
       </w:pPr>
       <w:r>
-        <w:t xml:space="preserve">F-11 — A quarter of the mutating admin routes wrote no audit row, including the one that changes a patient's sign-in email · </w:t>
+        <w:t xml:space="preserve">F-11 - A quarter of the mutating admin routes wrote no audit row, including the one that changes a patient's sign-in email · </w:t>
       </w:r>
       <w:r>
         <w:rPr>
@@ -14727,7 +14727,7 @@
         <w:t>"Every mutating admin route records what happened via `recordAdminActivity()` … Adding an action without a caller, or a mutating route without a call, puts the log back where it was."</w:t>
       </w:r>
       <w:r>
-        <w:t xml:space="preserve"> Pass 1 checked one half of that rule — every declared action has a caller — and found it clean. It did not check the other half.</w:t>
+        <w:t xml:space="preserve"> Pass 1 checked one half of that rule - every declared action has a caller - and found it clean. It did not check the other half.</w:t>
       </w:r>
     </w:p>
     <w:p>
@@ -14870,7 +14870,7 @@
               <w:t>gates sign-in</w:t>
             </w:r>
             <w:r>
-              <w:t xml:space="preserve"> — the route updates </w:t>
+              <w:t xml:space="preserve"> - the route updates </w:t>
             </w:r>
             <w:r>
               <w:rPr>
@@ -15320,7 +15320,7 @@
     <w:p/>
     <w:p>
       <w:r>
-        <w:t xml:space="preserve">Several have a private trail of their own — </w:t>
+        <w:t xml:space="preserve">Several have a private trail of their own - </w:t>
       </w:r>
       <w:r>
         <w:rPr>
@@ -15340,7 +15340,7 @@
         <w:t>risk_reviews</w:t>
       </w:r>
       <w:r>
-        <w:t xml:space="preserve"> is append-only — but none of them reaches the one log an admin can read across every screen, which is exactly what "who changed this?" is asked of.</w:t>
+        <w:t xml:space="preserve"> is append-only - but none of them reaches the one log an admin can read across every screen, which is exactly what "who changed this?" is asked of.</w:t>
       </w:r>
     </w:p>
     <w:p>
@@ -15360,7 +15360,7 @@
         <w:t>"a refund, a payout settlement or a cash-remittance confirmation was unattributable the moment more than one person had admin access"</w:t>
       </w:r>
       <w:r>
-        <w:t xml:space="preserve"> — and by that reasoning, a patient's sign-in email being changed by one of four admins with no record is the same failure in a place that decides whether somebody can get into their own account.</w:t>
+        <w:t xml:space="preserve"> - and by that reasoning, a patient's sign-in email being changed by one of four admins with no record is the same failure in a place that decides whether somebody can get into their own account.</w:t>
       </w:r>
     </w:p>
     <w:p>
@@ -15411,7 +15411,7 @@
         <w:t>Record&lt;AdminActivityAction, string&gt;</w:t>
       </w:r>
       <w:r>
-        <w:t xml:space="preserve">, so the compiler refused the change until every new action had a human label — the mechanism the file's own comment describes, working. Two placements are deliberate rather than mechanical: </w:t>
+        <w:t xml:space="preserve">, so the compiler refused the change until every new action had a human label - the mechanism the file's own comment describes, working. Two placements are deliberate rather than mechanical: </w:t>
       </w:r>
       <w:r>
         <w:rPr>
@@ -15503,7 +15503,7 @@
         <w:pStyle w:val="Heading3"/>
       </w:pPr>
       <w:r>
-        <w:t xml:space="preserve">F-12 — The plan referenced five test cases that were never written · </w:t>
+        <w:t xml:space="preserve">F-12 - The plan referenced five test cases that were never written · </w:t>
       </w:r>
       <w:r>
         <w:rPr>
@@ -15750,7 +15750,7 @@
         <w:t>Fix.</w:t>
       </w:r>
       <w:r>
-        <w:t xml:space="preserve"> The four missing cases written click-by-click — the patient Overview and booking hub, the therapist Overview and Edit Profile — </w:t>
+        <w:t xml:space="preserve"> The four missing cases written click-by-click - the patient Overview and booking hub, the therapist Overview and Edit Profile - </w:t>
       </w:r>
       <w:r>
         <w:rPr>
@@ -15840,7 +15840,7 @@
         <w:pStyle w:val="Heading3"/>
       </w:pPr>
       <w:r>
-        <w:t xml:space="preserve">F-13 — The therapist Overview's primary quick action was a dead link · </w:t>
+        <w:t xml:space="preserve">F-13 - The therapist Overview's primary quick action was a dead link · </w:t>
       </w:r>
       <w:r>
         <w:rPr>
@@ -15935,7 +15935,7 @@
         <w:t>/therapist/dashboard#availability</w:t>
       </w:r>
       <w:r>
-        <w:t xml:space="preserve"> — an anchor from when the dashboard was one long scrolled page. Availability became its own route when the dashboards were split, and </w:t>
+        <w:t xml:space="preserve"> - an anchor from when the dashboard was one long scrolled page. Availability became its own route when the dashboards were split, and </w:t>
       </w:r>
       <w:r>
         <w:rPr>
@@ -15966,7 +15966,7 @@
         <w:t>Why P2 for a one-line fix.</w:t>
       </w:r>
       <w:r>
-        <w:t xml:space="preserve"> It is the primary call to action on the screen a therapist lands on, for the one task the clinic most needs them to do — an empty roster is why sessions sit unassigned. It also fails silently: the page reloads, so it reads as a slow app rather than a broken link, which is why it survived. </w:t>
+        <w:t xml:space="preserve"> It is the primary call to action on the screen a therapist lands on, for the one task the clinic most needs them to do - an empty roster is why sessions sit unassigned. It also fails silently: the page reloads, so it reads as a slow app rather than a broken link, which is why it survived. </w:t>
       </w:r>
       <w:r>
         <w:rPr>
@@ -15992,7 +15992,7 @@
         <w:rPr>
           <w:i/>
         </w:rPr>
-        <w:t>"a stale link looks like it works — it just quietly lands somewhere else"</w:t>
+        <w:t>"a stale link looks like it works - it just quietly lands somewhere else"</w:t>
       </w:r>
       <w:r>
         <w:t>); the same hazard applies to any hand-written dashboard href, and this is the only one left in the four dashboards.</w:t>
@@ -16342,7 +16342,7 @@
           <w:p>
             <w:r/>
             <w:r>
-              <w:t>Policies exist in the file. Whether the live project has them applied is a different question — and the schema-apply workflow is the only thing that closes it</w:t>
+              <w:t>Policies exist in the file. Whether the live project has them applied is a different question - and the schema-apply workflow is the only thing that closes it</w:t>
             </w:r>
           </w:p>
         </w:tc>
@@ -16452,7 +16452,7 @@
               <w:t>not</w:t>
             </w:r>
             <w:r>
-              <w:t xml:space="preserve"> re-run this pass — there was no server to run them against — so </w:t>
+              <w:t xml:space="preserve"> re-run this pass - there was no server to run them against - so </w:t>
             </w:r>
             <w:r>
               <w:rPr>
@@ -16490,7 +16490,7 @@
         <w:t>Pass, after remediation, on both passes.</w:t>
       </w:r>
       <w:r>
-        <w:t xml:space="preserve"> The invariants the plan cares most about — the capture path, the ledger constraints, the append-only triggers, the split identities, the scope guards, the whole-hour rule, the single checkout quote — are all genuinely implemented where the plan says they are. </w:t>
+        <w:t xml:space="preserve"> The invariants the plan cares most about - the capture path, the ledger constraints, the append-only triggers, the split identities, the scope guards, the whole-hour rule, the single checkout quote - are all genuinely implemented where the plan says they are. </w:t>
       </w:r>
       <w:r>
         <w:rPr>
@@ -16529,7 +16529,7 @@
         <w:t>was</w:t>
       </w:r>
       <w:r>
-        <w:t xml:space="preserve"> fixed, in the instances somebody looked at. F-08's ordering fix reached the eleven routes a probe called, and 28 others kept the old order; F-02's schema fix was correct and a table written afterwards copied the pre-fix pattern. Neither was a regression in the ordinary sense — nothing was undone — and neither would have been caught by re-running the check that found it the first time. </w:t>
+        <w:t xml:space="preserve"> fixed, in the instances somebody looked at. F-08's ordering fix reached the eleven routes a probe called, and 28 others kept the old order; F-02's schema fix was correct and a table written afterwards copied the pre-fix pattern. Neither was a regression in the ordinary sense - nothing was undone - and neither would have been caught by re-running the check that found it the first time. </w:t>
       </w:r>
       <w:r>
         <w:rPr>
@@ -16549,7 +16549,7 @@
         <w:t>One thing still needs a person, not a commit.</w:t>
       </w:r>
       <w:r>
-        <w:t xml:space="preserve"> The schema changes across both passes — the redefined reset function, the two nullable </w:t>
+        <w:t xml:space="preserve"> The schema changes across both passes - the redefined reset function, the two nullable </w:t>
       </w:r>
       <w:r>
         <w:rPr>
@@ -16579,7 +16579,7 @@
         <w:t>auto_assign_therapist_enabled</w:t>
       </w:r>
       <w:r>
-        <w:t xml:space="preserve"> column and everything the branch has added since — reach a live database only when </w:t>
+        <w:t xml:space="preserve"> column and everything the branch has added since - reach a live database only when </w:t>
       </w:r>
       <w:r>
         <w:rPr>
@@ -16652,7 +16652,7 @@
         <w:pStyle w:val="Heading2"/>
       </w:pPr>
       <w:r>
-        <w:t>7. Product review — flows worth changing</w:t>
+        <w:t>7. Product review - flows worth changing</w:t>
       </w:r>
     </w:p>
     <w:p>
@@ -16938,7 +16938,7 @@
               <w:t>Documented</w:t>
             </w:r>
             <w:r>
-              <w:t xml:space="preserve"> — an ops change, not a code one</w:t>
+              <w:t xml:space="preserve"> - an ops change, not a code one</w:t>
             </w:r>
           </w:p>
         </w:tc>
@@ -16979,7 +16979,7 @@
               <w:t>Half shipped</w:t>
             </w:r>
             <w:r>
-              <w:t xml:space="preserve"> — the screen now says what it decides; removing the gate is the owner's call</w:t>
+              <w:t xml:space="preserve"> - the screen now says what it decides; removing the gate is the owner's call</w:t>
             </w:r>
           </w:p>
         </w:tc>
@@ -17117,7 +17117,7 @@
         <w:t>confirmed</w:t>
       </w:r>
       <w:r>
-        <w:t xml:space="preserve">, only then does a Meet link exist, and only then does the therapist see it. The roster — weekly schedule, exceptions, leave — is maintained in detail and deliberately does </w:t>
+        <w:t xml:space="preserve">, only then does a Meet link exist, and only then does the therapist see it. The roster - weekly schedule, exceptions, leave - is maintained in detail and deliberately does </w:t>
       </w:r>
       <w:r>
         <w:rPr>
@@ -17158,7 +17158,7 @@
         <w:t>The change.</w:t>
       </w:r>
       <w:r>
-        <w:t xml:space="preserve"> Keep the picker unfiltered — that separation is deliberate and correct, and constraining what a patient may ask for is a different, worse product. But use the roster </w:t>
+        <w:t xml:space="preserve"> Keep the picker unfiltered - that separation is deliberate and correct, and constraining what a patient may ask for is a different, worse product. But use the roster </w:t>
       </w:r>
       <w:r>
         <w:rPr>
@@ -17178,7 +17178,7 @@
         <w:t>Why it is safe.</w:t>
       </w:r>
       <w:r>
-        <w:t xml:space="preserve"> Every component already exists — </w:t>
+        <w:t xml:space="preserve"> Every component already exists - </w:t>
       </w:r>
       <w:r>
         <w:rPr>
@@ -17289,7 +17289,7 @@
         <w:t>/api/razorpay/webhook</w:t>
       </w:r>
       <w:r>
-        <w:t xml:space="preserve"> — both, so a patient who pays and closes the tab gets the same outcome as one who waits for the page, and neither path can develop its own idea of who is free. It reads the roster (weekly template, that date's exceptions, </w:t>
+        <w:t xml:space="preserve"> - both, so a patient who pays and closes the tab gets the same outcome as one who waits for the page, and neither path can develop its own idea of who is free. It reads the roster (weekly template, that date's exceptions, </w:t>
       </w:r>
       <w:r>
         <w:rPr>
@@ -17338,7 +17338,7 @@
         <w:t>auto_assign_therapist_enabled</w:t>
       </w:r>
       <w:r>
-        <w:t xml:space="preserve"> — </w:t>
+        <w:t xml:space="preserve"> - </w:t>
       </w:r>
       <w:r>
         <w:rPr>
@@ -17451,7 +17451,7 @@
         <w:t>plan_conversion_low</w:t>
       </w:r>
       <w:r>
-        <w:t xml:space="preserve"> in a log-only posture for a month to establish the clinic's baseline — the reason it ships disabled is precisely that a threshold invented before a baseline fires on everyone or nobody, and that reasoning is right. Then, and only then, decide whether the prompt needs strengthening.</w:t>
+        <w:t xml:space="preserve"> in a log-only posture for a month to establish the clinic's baseline - the reason it ships disabled is precisely that a threshold invented before a baseline fires on everyone or nobody, and that reasoning is right. Then, and only then, decide whether the prompt needs strengthening.</w:t>
       </w:r>
     </w:p>
     <w:p>
@@ -17483,7 +17483,7 @@
         <w:t>SHIPPED (the cheap half).</w:t>
       </w:r>
       <w:r>
-        <w:t xml:space="preserve"> The therapist's Overview feed now carries a named item per patient — </w:t>
+        <w:t xml:space="preserve"> The therapist's Overview feed now carries a named item per patient - </w:t>
       </w:r>
       <w:r>
         <w:rPr>
@@ -17492,7 +17492,7 @@
         <w:t>"QA Patient A is waiting to hear what next"</w:t>
       </w:r>
       <w:r>
-        <w:t xml:space="preserve"> — pinned by </w:t>
+        <w:t xml:space="preserve"> - pinned by </w:t>
       </w:r>
       <w:r>
         <w:rPr>
@@ -17521,7 +17521,7 @@
         <w:t>The measurement half is still the right first move</w:t>
       </w:r>
       <w:r>
-        <w:t xml:space="preserve"> — </w:t>
+        <w:t xml:space="preserve"> - </w:t>
       </w:r>
       <w:r>
         <w:rPr>
@@ -17565,16 +17565,16 @@
         <w:t>Pay ₹… Now</w:t>
       </w:r>
       <w:r>
-        <w:t xml:space="preserve">. The reassuring message — </w:t>
+        <w:t xml:space="preserve">. The reassuring message - </w:t>
       </w:r>
       <w:r>
         <w:rPr>
           <w:i/>
         </w:rPr>
-        <w:t>"Your booking is saved as pending — you can come back and pay any time from your dashboard"</w:t>
-      </w:r>
-      <w:r>
-        <w:t xml:space="preserve"> — appears only after </w:t>
+        <w:t>"Your booking is saved as pending - you can come back and pay any time from your dashboard"</w:t>
+      </w:r>
+      <w:r>
+        <w:t xml:space="preserve"> - appears only after </w:t>
       </w:r>
       <w:r>
         <w:rPr>
@@ -17641,7 +17641,7 @@
         <w:rPr>
           <w:i/>
         </w:rPr>
-        <w:t>"Nothing was lost — your booking is saved and still held as unpaid. You can try again above, or pay later from your dashboard."</w:t>
+        <w:t>"Nothing was lost - your booking is saved and still held as unpaid. You can try again above, or pay later from your dashboard."</w:t>
       </w:r>
       <w:r>
         <w:t xml:space="preserve"> The amber escape hatch to the dashboard still waits until three, because that is the point at which retrying here has plainly stopped working. </w:t>
@@ -17795,7 +17795,7 @@
         <w:t>Today.</w:t>
       </w:r>
       <w:r>
-        <w:t xml:space="preserve"> There is no cron, by design. The sweeps run at page render — and the audit confirms </w:t>
+        <w:t xml:space="preserve"> There is no cron, by design. The sweeps run at page render - and the audit confirms </w:t>
       </w:r>
       <w:r>
         <w:rPr>
@@ -17826,7 +17826,7 @@
         <w:t>The change.</w:t>
       </w:r>
       <w:r>
-        <w:t xml:space="preserve"> Do not build a worker — the no-cron rule buys real simplicity and the sweeps are correctly bounded. Instead point a free uptime monitor at one authenticated-free endpoint every fifteen minutes. That is a configuration change with no code, and it converts "when an admin looks" into "every fifteen minutes" for the two sweeps that most need it.</w:t>
+        <w:t xml:space="preserve"> Do not build a worker - the no-cron rule buys real simplicity and the sweeps are correctly bounded. Instead point a free uptime monitor at one authenticated-free endpoint every fifteen minutes. That is a configuration change with no code, and it converts "when an admin looks" into "every fifteen minutes" for the two sweeps that most need it.</w:t>
       </w:r>
     </w:p>
     <w:p>
@@ -17834,7 +17834,7 @@
         <w:rPr>
           <w:b/>
         </w:rPr>
-        <w:t>NOT SHIPPED, deliberately — this one is an ops change, not a code change.</w:t>
+        <w:t>NOT SHIPPED, deliberately - this one is an ops change, not a code change.</w:t>
       </w:r>
       <w:r>
         <w:t xml:space="preserve"> Adding an endpoint that runs the sweeps would be a worker in all but name, and would undo the property that makes the no-cron design defensible: every sweep is bounded because it runs inside a render somebody is waiting for. The recommendation stands as written, for whoever configures the deployment.</w:t>
@@ -17881,7 +17881,7 @@
         <w:t>without</w:t>
       </w:r>
       <w:r>
-        <w:t xml:space="preserve"> paying — and the plan's own §4.3 explains that this is deliberate, so that a failing card does not bounce someone to </w:t>
+        <w:t xml:space="preserve"> paying - and the plan's own §4.3 explains that this is deliberate, so that a failing card does not bounce someone to </w:t>
       </w:r>
       <w:r>
         <w:rPr>
@@ -17924,13 +17924,13 @@
         <w:t>HALF SHIPPED.</w:t>
       </w:r>
       <w:r>
-        <w:t xml:space="preserve"> The first option is done: Today → Approvals now states what it is deciding — </w:t>
+        <w:t xml:space="preserve"> The first option is done: Today → Approvals now states what it is deciding - </w:t>
       </w:r>
       <w:r>
         <w:rPr>
           <w:i/>
         </w:rPr>
-        <w:t>"Therapists here are waiting on a credentials check. Patients here registered without booking — a patient who starts a payment is approved automatically, so approving one from this list only affects what they can see, never whether they can pay."</w:t>
+        <w:t>"Therapists here are waiting on a credentials check. Patients here registered without booking - a patient who starts a payment is approved automatically, so approving one from this list only affects what they can see, never whether they can pay."</w:t>
       </w:r>
       <w:r>
         <w:t xml:space="preserve"> </w:t>
@@ -18001,7 +18001,7 @@
     </w:p>
     <w:p>
       <w:r>
-        <w:t>The first is the main re-booking mechanism — a therapist proposing the next session on a live programme — fully built, tested, and switched off. The second is a completed migration to an append-only credit ledger, with both systems written in parallel and a verification report on Settings → System Health.</w:t>
+        <w:t>The first is the main re-booking mechanism - a therapist proposing the next session on a live programme - fully built, tested, and switched off. The second is a completed migration to an append-only credit ledger, with both systems written in parallel and a verification report on Settings → System Health.</w:t>
       </w:r>
     </w:p>
     <w:p>
@@ -18034,7 +18034,7 @@
         <w:t>Ledger:</w:t>
       </w:r>
       <w:r>
-        <w:t xml:space="preserve"> the parallel-write period is the risky state, not the destination — two sources of truth for session balances is precisely the condition the ledger was built to end. Once System Health has been clean over real traffic for an agreed window, flip it, then plan the removal of the counter writes. Carrying both indefinitely is the one outcome nobody chose.</w:t>
+        <w:t xml:space="preserve"> the parallel-write period is the risky state, not the destination - two sources of truth for session balances is precisely the condition the ledger was built to end. Once System Health has been clean over real traffic for an agreed window, flip it, then plan the removal of the counter writes. Carrying both indefinitely is the one outcome nobody chose.</w:t>
       </w:r>
     </w:p>
     <w:p>
@@ -18188,7 +18188,7 @@
           <w:p>
             <w:r/>
             <w:r>
-              <w:t>Read-only until a therapist writes the first record, with the CTA absent rather than disabled — correct, and deliberately quiet</w:t>
+              <w:t>Read-only until a therapist writes the first record, with the CTA absent rather than disabled - correct, and deliberately quiet</w:t>
             </w:r>
           </w:p>
         </w:tc>
@@ -18205,7 +18205,7 @@
               <w:t>Shipped.</w:t>
             </w:r>
             <w:r>
-              <w:t xml:space="preserve"> The waiting panel now names the session by date — </w:t>
+              <w:t xml:space="preserve"> The waiting panel now names the session by date - </w:t>
             </w:r>
             <w:r>
               <w:rPr>
@@ -18274,7 +18274,7 @@
               <w:t>Still open</w:t>
             </w:r>
             <w:r>
-              <w:t xml:space="preserve"> — it is a product decision (is this a one-timezone clinic?), not a defect, and is item 2 in the plan's own clarifications list. Either expose it on the therapist's profile or drop the column</w:t>
+              <w:t xml:space="preserve"> - it is a product decision (is this a one-timezone clinic?), not a defect, and is item 2 in the plan's own clarifications list. Either expose it on the therapist's profile or drop the column</w:t>
             </w:r>
           </w:p>
         </w:tc>
@@ -18312,7 +18312,7 @@
           <w:p>
             <w:r/>
             <w:r>
-              <w:t xml:space="preserve">Whatever is decided for F-01, make it deliberate — configuration that survives a wipe should do so for the same stated reason </w:t>
+              <w:t xml:space="preserve">Whatever is decided for F-01, make it deliberate - configuration that survives a wipe should do so for the same stated reason </w:t>
             </w:r>
             <w:r>
               <w:rPr>
@@ -18387,7 +18387,7 @@
         <w:t>A therapist picks a package, never a price.</w:t>
       </w:r>
       <w:r>
-        <w:t xml:space="preserve"> "The therapist set their own price" is not a policy someone enforces — it is a thing the schema cannot express. That is a much stronger guarantee than a rule, and it costs nothing.</w:t>
+        <w:t xml:space="preserve"> "The therapist set their own price" is not a policy someone enforces - it is a thing the schema cannot express. That is a much stronger guarantee than a rule, and it costs nothing.</w:t>
       </w:r>
     </w:p>
     <w:p>
@@ -18558,7 +18558,7 @@
               <w:t>autoAssignTherapist.ts</w:t>
             </w:r>
             <w:r>
-              <w:t xml:space="preserve"> assigns when exactly one rostered, approved, un-clashing therapist is free — or when the patient's own requested therapist is among them — from both payment-confirmation paths, gated by </w:t>
+              <w:t xml:space="preserve"> assigns when exactly one rostered, approved, un-clashing therapist is free - or when the patient's own requested therapist is among them - from both payment-confirmation paths, gated by </w:t>
             </w:r>
             <w:r>
               <w:rPr>
@@ -18710,7 +18710,7 @@
               <w:t>Shipped</w:t>
             </w:r>
             <w:r>
-              <w:t xml:space="preserve"> — the Payment Confirmations panel on System Health</w:t>
+              <w:t xml:space="preserve"> - the Payment Confirmations panel on System Health</w:t>
             </w:r>
           </w:p>
         </w:tc>
@@ -18792,7 +18792,7 @@
               <w:t>Still open</w:t>
             </w:r>
             <w:r>
-              <w:t xml:space="preserve"> — a product decision</w:t>
+              <w:t xml:space="preserve"> - a product decision</w:t>
             </w:r>
           </w:p>
         </w:tc>
@@ -18871,7 +18871,7 @@
               <w:t>still false</w:t>
             </w:r>
             <w:r>
-              <w:t>, and the parallel-write period is still the risky state rather than the destination — this is the one item on the list that has been waiting longest and costs the most to keep waiting</w:t>
+              <w:t>, and the parallel-write period is still the risky state rather than the destination - this is the one item on the list that has been waiting longest and costs the most to keep waiting</w:t>
             </w:r>
           </w:p>
         </w:tc>

</xml_diff>